<commit_message>
Continue validated replica-transfer research and record open order verdict
Add half-row checkpoints, matched-rate feasibility outcomes, fourth-Clifford quotient and finite spectra, d=3 and n=4 pilots, 246-check receipt, reports, thirteenth amendment, and refreshed review bundle. Remove cached third-party corpora from current tree without rewriting history.
</commit_message>
<xml_diff>
--- a/papers/v33/v33-revision-report.docx
+++ b/papers/v33/v33-revision-report.docx
@@ -12,6 +12,58 @@
           <w:i w:val="0"/>
         </w:rPr>
         <w:t>v33: assessment, verification, and implemented revision</w:t>
+      </w:r>
+    </w:p>
+    <w:p>
+      <w:pPr>
+        <w:ind w:left="567" w:right="340"/>
+        <w:pBdr>
+          <w:left w:val="single" w:sz="12" w:space="8" w:color="1F2A44"/>
+        </w:pBdr>
+      </w:pPr>
+      <w:r>
+        <w:rPr>
+          <w:b/>
+          <w:i w:val="0"/>
+        </w:rPr>
+        <w:t>Historical v33 delivery report.</w:t>
+      </w:r>
+      <w:r>
+        <w:rPr>
+          <w:b w:val="0"/>
+          <w:i w:val="0"/>
+        </w:rPr>
+        <w:t xml:space="preserve"> The later method choice, additional computations and authorized GitHub publication are documented in </w:t>
+      </w:r>
+      <w:r>
+        <w:rPr>
+          <w:rFonts w:ascii="Consolas" w:hAnsi="Consolas" w:eastAsia="Consolas" w:cs="Consolas"/>
+          <w:b w:val="0"/>
+          <w:i w:val="0"/>
+        </w:rPr>
+        <w:t>research/transition-order/PLAN.md</w:t>
+      </w:r>
+      <w:r>
+        <w:rPr>
+          <w:b w:val="0"/>
+          <w:i w:val="0"/>
+        </w:rPr>
+        <w:t xml:space="preserve"> and </w:t>
+      </w:r>
+      <w:r>
+        <w:rPr>
+          <w:rFonts w:ascii="Consolas" w:hAnsi="Consolas" w:eastAsia="Consolas" w:cs="Consolas"/>
+          <w:b w:val="0"/>
+          <w:i w:val="0"/>
+        </w:rPr>
+        <w:t>RESULTS.md</w:t>
+      </w:r>
+      <w:r>
+        <w:rPr>
+          <w:b w:val="0"/>
+          <w:i w:val="0"/>
+        </w:rPr>
+        <w:t>. The original outcome/totals below are retained as a dated record, not asserted as the latest execution status.</w:t>
       </w:r>
     </w:p>
     <w:p>

</xml_diff>